<commit_message>
adición de conclusiones para la ponencia en el congreso de innovaciones educativas
</commit_message>
<xml_diff>
--- a/propuesta/prop_invest/Congreso_Internacional_de_Investigacion_en_Innovacion_Educativa_2023/plantilla-presentacion-contribuciones-innovación.docx
+++ b/propuesta/prop_invest/Congreso_Internacional_de_Investigacion_en_Innovacion_Educativa_2023/plantilla-presentacion-contribuciones-innovación.docx
@@ -1339,6 +1339,7 @@
         </w:rPr>
         <w:t xml:space="preserve">  </w:t>
       </w:r>
+      <w:proofErr w:type="gramStart"/>
       <w:r>
         <w:rPr>
           <w:rFonts w:ascii="Arial" w:hAnsi="Arial" w:cs="Arial"/>
@@ -1347,6 +1348,7 @@
         <w:tab/>
         <w:t>XX.XX.XXXX</w:t>
       </w:r>
+      <w:proofErr w:type="gramEnd"/>
     </w:p>
     <w:p>
       <w:pPr>
@@ -1371,6 +1373,7 @@
         </w:rPr>
         <w:t xml:space="preserve">: </w:t>
       </w:r>
+      <w:proofErr w:type="gramStart"/>
       <w:r>
         <w:rPr>
           <w:rFonts w:ascii="Arial" w:hAnsi="Arial" w:cs="Arial"/>
@@ -1379,6 +1382,7 @@
         <w:tab/>
         <w:t>XX.XX.XXXX</w:t>
       </w:r>
+      <w:proofErr w:type="gramEnd"/>
     </w:p>
     <w:p>
       <w:pPr>
@@ -1534,6 +1538,140 @@
           <w:lang w:val="es-CO"/>
         </w:rPr>
         <w:t xml:space="preserve"> que tiene la innovación planteada.</w:t>
+      </w:r>
+    </w:p>
+    <w:p>
+      <w:pPr>
+        <w:rPr>
+          <w:rFonts w:ascii="Arial" w:hAnsi="Arial" w:cs="Arial"/>
+          <w:szCs w:val="20"/>
+          <w:lang w:val="es-CO"/>
+        </w:rPr>
+      </w:pPr>
+    </w:p>
+    <w:p>
+      <w:pPr>
+        <w:rPr>
+          <w:rFonts w:ascii="Arial" w:hAnsi="Arial" w:cs="Arial"/>
+          <w:szCs w:val="20"/>
+          <w:lang w:val="es-CO"/>
+        </w:rPr>
+      </w:pPr>
+      <w:r>
+        <w:rPr>
+          <w:rFonts w:ascii="Arial" w:hAnsi="Arial" w:cs="Arial"/>
+          <w:szCs w:val="20"/>
+          <w:lang w:val="es-CO"/>
+        </w:rPr>
+        <w:t xml:space="preserve">El marco teórico de la innovación planteada se fundamenta en la integración de la enseñanza del machine </w:t>
+      </w:r>
+      <w:proofErr w:type="spellStart"/>
+      <w:r>
+        <w:rPr>
+          <w:rFonts w:ascii="Arial" w:hAnsi="Arial" w:cs="Arial"/>
+          <w:szCs w:val="20"/>
+          <w:lang w:val="es-CO"/>
+        </w:rPr>
+        <w:t>learning</w:t>
+      </w:r>
+      <w:proofErr w:type="spellEnd"/>
+      <w:r>
+        <w:rPr>
+          <w:rFonts w:ascii="Arial" w:hAnsi="Arial" w:cs="Arial"/>
+          <w:szCs w:val="20"/>
+          <w:lang w:val="es-CO"/>
+        </w:rPr>
+        <w:t xml:space="preserve"> con el enfoque pedagógico del Aprendizaje Invertido. Este enfoque promueve la inversión del modelo tradicional de enseñanza, donde los estudiantes adquieren el conocimiento teórico en casa y aplican conceptos prácticos en el aula. En este caso, los estudiantes tienen acceso a recursos educativos interactivos y tutoriales en plataformas como YouTube, que les permiten adquirir conocimientos básicos antes de asistir a las clases. Durante las clases, se utilizan herramientas tecnológicas como </w:t>
+      </w:r>
+      <w:proofErr w:type="spellStart"/>
+      <w:r>
+        <w:rPr>
+          <w:rFonts w:ascii="Arial" w:hAnsi="Arial" w:cs="Arial"/>
+          <w:szCs w:val="20"/>
+          <w:lang w:val="es-CO"/>
+        </w:rPr>
+        <w:t>Jupyter</w:t>
+      </w:r>
+      <w:proofErr w:type="spellEnd"/>
+      <w:r>
+        <w:rPr>
+          <w:rFonts w:ascii="Arial" w:hAnsi="Arial" w:cs="Arial"/>
+          <w:szCs w:val="20"/>
+          <w:lang w:val="es-CO"/>
+        </w:rPr>
+        <w:t xml:space="preserve"> de Anaconda, Google </w:t>
+      </w:r>
+      <w:proofErr w:type="spellStart"/>
+      <w:r>
+        <w:rPr>
+          <w:rFonts w:ascii="Arial" w:hAnsi="Arial" w:cs="Arial"/>
+          <w:szCs w:val="20"/>
+          <w:lang w:val="es-CO"/>
+        </w:rPr>
+        <w:t>Colab</w:t>
+      </w:r>
+      <w:proofErr w:type="spellEnd"/>
+      <w:r>
+        <w:rPr>
+          <w:rFonts w:ascii="Arial" w:hAnsi="Arial" w:cs="Arial"/>
+          <w:szCs w:val="20"/>
+          <w:lang w:val="es-CO"/>
+        </w:rPr>
+        <w:t xml:space="preserve"> y Visual Studio </w:t>
+      </w:r>
+      <w:proofErr w:type="spellStart"/>
+      <w:r>
+        <w:rPr>
+          <w:rFonts w:ascii="Arial" w:hAnsi="Arial" w:cs="Arial"/>
+          <w:szCs w:val="20"/>
+          <w:lang w:val="es-CO"/>
+        </w:rPr>
+        <w:t>Code</w:t>
+      </w:r>
+      <w:proofErr w:type="spellEnd"/>
+      <w:r>
+        <w:rPr>
+          <w:rFonts w:ascii="Arial" w:hAnsi="Arial" w:cs="Arial"/>
+          <w:szCs w:val="20"/>
+          <w:lang w:val="es-CO"/>
+        </w:rPr>
+        <w:t xml:space="preserve">, que brindan un entorno práctico para experimentar con algoritmos y técnicas de machine </w:t>
+      </w:r>
+      <w:proofErr w:type="spellStart"/>
+      <w:r>
+        <w:rPr>
+          <w:rFonts w:ascii="Arial" w:hAnsi="Arial" w:cs="Arial"/>
+          <w:szCs w:val="20"/>
+          <w:lang w:val="es-CO"/>
+        </w:rPr>
+        <w:t>learning</w:t>
+      </w:r>
+      <w:proofErr w:type="spellEnd"/>
+      <w:r>
+        <w:rPr>
+          <w:rFonts w:ascii="Arial" w:hAnsi="Arial" w:cs="Arial"/>
+          <w:szCs w:val="20"/>
+          <w:lang w:val="es-CO"/>
+        </w:rPr>
+        <w:t xml:space="preserve">. Además, se fomenta la colaboración y el intercambio de conocimientos a través de la integración de las redes sociales GitHub y YouTube. Esta combinación de enfoque pedagógico invertido y herramientas tecnológicas permite a los estudiantes desarrollar habilidades prácticas en el campo del machine </w:t>
+      </w:r>
+      <w:proofErr w:type="spellStart"/>
+      <w:r>
+        <w:rPr>
+          <w:rFonts w:ascii="Arial" w:hAnsi="Arial" w:cs="Arial"/>
+          <w:szCs w:val="20"/>
+          <w:lang w:val="es-CO"/>
+        </w:rPr>
+        <w:t>learning</w:t>
+      </w:r>
+      <w:proofErr w:type="spellEnd"/>
+      <w:r>
+        <w:rPr>
+          <w:rFonts w:ascii="Arial" w:hAnsi="Arial" w:cs="Arial"/>
+          <w:szCs w:val="20"/>
+          <w:lang w:val="es-CO"/>
+        </w:rPr>
+        <w:t>, fortalecer su comprensión teórica y promover la colaboración en proyectos de aprendizaje conjuntos.</w:t>
       </w:r>
     </w:p>
     <w:p>
@@ -1626,6 +1764,194 @@
       <w:pPr>
         <w:rPr>
           <w:rFonts w:ascii="Arial" w:hAnsi="Arial" w:cs="Arial"/>
+          <w:szCs w:val="20"/>
+          <w:lang w:val="es-CO"/>
+        </w:rPr>
+      </w:pPr>
+    </w:p>
+    <w:p>
+      <w:pPr>
+        <w:rPr>
+          <w:rFonts w:ascii="Arial" w:hAnsi="Arial" w:cs="Arial"/>
+          <w:szCs w:val="20"/>
+          <w:lang w:val="es-CO"/>
+        </w:rPr>
+      </w:pPr>
+      <w:r>
+        <w:rPr>
+          <w:rFonts w:ascii="Arial" w:hAnsi="Arial" w:cs="Arial"/>
+          <w:szCs w:val="20"/>
+          <w:lang w:val="es-CO"/>
+        </w:rPr>
+        <w:t xml:space="preserve">La innovación educativa en la Universidad de Antioquia consiste en la enseñanza del machine </w:t>
+      </w:r>
+      <w:proofErr w:type="spellStart"/>
+      <w:r>
+        <w:rPr>
+          <w:rFonts w:ascii="Arial" w:hAnsi="Arial" w:cs="Arial"/>
+          <w:szCs w:val="20"/>
+          <w:lang w:val="es-CO"/>
+        </w:rPr>
+        <w:t>learning</w:t>
+      </w:r>
+      <w:proofErr w:type="spellEnd"/>
+      <w:r>
+        <w:rPr>
+          <w:rFonts w:ascii="Arial" w:hAnsi="Arial" w:cs="Arial"/>
+          <w:szCs w:val="20"/>
+          <w:lang w:val="es-CO"/>
+        </w:rPr>
+        <w:t xml:space="preserve"> bajo el enfoque pedagógico del aprendizaje invertido, respaldado por diversas aplicaciones y plataformas tecnológicas. Entre estas se encuentran </w:t>
+      </w:r>
+      <w:proofErr w:type="spellStart"/>
+      <w:r>
+        <w:rPr>
+          <w:rFonts w:ascii="Arial" w:hAnsi="Arial" w:cs="Arial"/>
+          <w:szCs w:val="20"/>
+          <w:lang w:val="es-CO"/>
+        </w:rPr>
+        <w:t>Jupyter</w:t>
+      </w:r>
+      <w:proofErr w:type="spellEnd"/>
+      <w:r>
+        <w:rPr>
+          <w:rFonts w:ascii="Arial" w:hAnsi="Arial" w:cs="Arial"/>
+          <w:szCs w:val="20"/>
+          <w:lang w:val="es-CO"/>
+        </w:rPr>
+        <w:t xml:space="preserve"> de Anaconda, Google </w:t>
+      </w:r>
+      <w:proofErr w:type="spellStart"/>
+      <w:r>
+        <w:rPr>
+          <w:rFonts w:ascii="Arial" w:hAnsi="Arial" w:cs="Arial"/>
+          <w:szCs w:val="20"/>
+          <w:lang w:val="es-CO"/>
+        </w:rPr>
+        <w:t>Colab</w:t>
+      </w:r>
+      <w:proofErr w:type="spellEnd"/>
+      <w:r>
+        <w:rPr>
+          <w:rFonts w:ascii="Arial" w:hAnsi="Arial" w:cs="Arial"/>
+          <w:szCs w:val="20"/>
+          <w:lang w:val="es-CO"/>
+        </w:rPr>
+        <w:t xml:space="preserve"> de Google, </w:t>
+      </w:r>
+      <w:proofErr w:type="spellStart"/>
+      <w:r>
+        <w:rPr>
+          <w:rFonts w:ascii="Arial" w:hAnsi="Arial" w:cs="Arial"/>
+          <w:szCs w:val="20"/>
+          <w:lang w:val="es-CO"/>
+        </w:rPr>
+        <w:t>GitBash</w:t>
+      </w:r>
+      <w:proofErr w:type="spellEnd"/>
+      <w:r>
+        <w:rPr>
+          <w:rFonts w:ascii="Arial" w:hAnsi="Arial" w:cs="Arial"/>
+          <w:szCs w:val="20"/>
+          <w:lang w:val="es-CO"/>
+        </w:rPr>
+        <w:t xml:space="preserve">, Visual Studio </w:t>
+      </w:r>
+      <w:proofErr w:type="spellStart"/>
+      <w:r>
+        <w:rPr>
+          <w:rFonts w:ascii="Arial" w:hAnsi="Arial" w:cs="Arial"/>
+          <w:szCs w:val="20"/>
+          <w:lang w:val="es-CO"/>
+        </w:rPr>
+        <w:t>Code</w:t>
+      </w:r>
+      <w:proofErr w:type="spellEnd"/>
+      <w:r>
+        <w:rPr>
+          <w:rFonts w:ascii="Arial" w:hAnsi="Arial" w:cs="Arial"/>
+          <w:szCs w:val="20"/>
+          <w:lang w:val="es-CO"/>
+        </w:rPr>
+        <w:t xml:space="preserve">, WhatsApp, GitHub y YouTube. En particular, se destaca el canal </w:t>
+      </w:r>
+      <w:proofErr w:type="spellStart"/>
+      <w:r>
+        <w:rPr>
+          <w:rFonts w:ascii="Arial" w:hAnsi="Arial" w:cs="Arial"/>
+          <w:szCs w:val="20"/>
+          <w:lang w:val="es-CO"/>
+        </w:rPr>
+        <w:t>DiMathData</w:t>
+      </w:r>
+      <w:proofErr w:type="spellEnd"/>
+      <w:r>
+        <w:rPr>
+          <w:rFonts w:ascii="Arial" w:hAnsi="Arial" w:cs="Arial"/>
+          <w:szCs w:val="20"/>
+          <w:lang w:val="es-CO"/>
+        </w:rPr>
+        <w:t xml:space="preserve"> en YouTube, que se centra en la didáctica de la Matemática y la Ciencia de Datos, proporcionando recursos y tutoriales relevantes para el aprendizaje de machine </w:t>
+      </w:r>
+      <w:proofErr w:type="spellStart"/>
+      <w:r>
+        <w:rPr>
+          <w:rFonts w:ascii="Arial" w:hAnsi="Arial" w:cs="Arial"/>
+          <w:szCs w:val="20"/>
+          <w:lang w:val="es-CO"/>
+        </w:rPr>
+        <w:t>learning</w:t>
+      </w:r>
+      <w:proofErr w:type="spellEnd"/>
+      <w:r>
+        <w:rPr>
+          <w:rFonts w:ascii="Arial" w:hAnsi="Arial" w:cs="Arial"/>
+          <w:szCs w:val="20"/>
+          <w:lang w:val="es-CO"/>
+        </w:rPr>
+        <w:t xml:space="preserve">. Además, en GitHub se encuentra el repositorio "7_didactica_ciencia_datos", que constituye una unidad didáctica completa diseñada específicamente para la enseñanza del machine </w:t>
+      </w:r>
+      <w:proofErr w:type="spellStart"/>
+      <w:r>
+        <w:rPr>
+          <w:rFonts w:ascii="Arial" w:hAnsi="Arial" w:cs="Arial"/>
+          <w:szCs w:val="20"/>
+          <w:lang w:val="es-CO"/>
+        </w:rPr>
+        <w:t>learning</w:t>
+      </w:r>
+      <w:proofErr w:type="spellEnd"/>
+      <w:r>
+        <w:rPr>
+          <w:rFonts w:ascii="Arial" w:hAnsi="Arial" w:cs="Arial"/>
+          <w:szCs w:val="20"/>
+          <w:lang w:val="es-CO"/>
+        </w:rPr>
+        <w:t xml:space="preserve">. Esta unidad didáctica brinda acceso a materiales educativos interactivos, ejemplos de código, conjuntos de datos y proyectos prácticos, permitiendo a los estudiantes adquirir conocimientos teóricos y aplicarlos de manera práctica en un entorno colaborativo. Esta combinación de enfoque pedagógico invertido y herramientas tecnológicas proporciona a los estudiantes de la Universidad de Antioquia una experiencia de aprendizaje enriquecedora y completa en el campo del machine </w:t>
+      </w:r>
+      <w:proofErr w:type="spellStart"/>
+      <w:r>
+        <w:rPr>
+          <w:rFonts w:ascii="Arial" w:hAnsi="Arial" w:cs="Arial"/>
+          <w:szCs w:val="20"/>
+          <w:lang w:val="es-CO"/>
+        </w:rPr>
+        <w:t>learning</w:t>
+      </w:r>
+      <w:proofErr w:type="spellEnd"/>
+      <w:r>
+        <w:rPr>
+          <w:rFonts w:ascii="Arial" w:hAnsi="Arial" w:cs="Arial"/>
+          <w:szCs w:val="20"/>
+          <w:lang w:val="es-CO"/>
+        </w:rPr>
+        <w:t>, promoviendo la comprensión profunda de los conceptos, la adquisición de habilidades prácticas y la colaboración entre pares.</w:t>
+      </w:r>
+    </w:p>
+    <w:p>
+      <w:pPr>
+        <w:rPr>
+          <w:rFonts w:ascii="Arial" w:hAnsi="Arial" w:cs="Arial"/>
           <w:b/>
           <w:bCs/>
           <w:szCs w:val="20"/>
@@ -2058,6 +2384,419 @@
         </w:rPr>
         <w:t>.</w:t>
       </w:r>
+    </w:p>
+    <w:p>
+      <w:pPr>
+        <w:rPr>
+          <w:rFonts w:ascii="Arial" w:hAnsi="Arial" w:cs="Arial"/>
+          <w:szCs w:val="20"/>
+        </w:rPr>
+      </w:pPr>
+    </w:p>
+    <w:p>
+      <w:pPr>
+        <w:rPr>
+          <w:rFonts w:ascii="Arial" w:hAnsi="Arial" w:cs="Arial"/>
+          <w:szCs w:val="20"/>
+        </w:rPr>
+      </w:pPr>
+    </w:p>
+    <w:p>
+      <w:pPr>
+        <w:rPr>
+          <w:rFonts w:ascii="Arial" w:hAnsi="Arial" w:cs="Arial"/>
+          <w:b/>
+          <w:bCs/>
+          <w:szCs w:val="20"/>
+        </w:rPr>
+      </w:pPr>
+      <w:r>
+        <w:rPr>
+          <w:rFonts w:ascii="Arial" w:hAnsi="Arial" w:cs="Arial"/>
+          <w:b/>
+          <w:bCs/>
+          <w:szCs w:val="20"/>
+        </w:rPr>
+        <w:t xml:space="preserve">Contribución de esta propuesta a los ODS  </w:t>
+      </w:r>
+    </w:p>
+    <w:p>
+      <w:pPr>
+        <w:rPr>
+          <w:rFonts w:ascii="Arial" w:hAnsi="Arial" w:cs="Arial"/>
+          <w:szCs w:val="20"/>
+        </w:rPr>
+      </w:pPr>
+    </w:p>
+    <w:p>
+      <w:pPr>
+        <w:rPr>
+          <w:rFonts w:ascii="Arial" w:hAnsi="Arial" w:cs="Arial"/>
+          <w:szCs w:val="20"/>
+        </w:rPr>
+      </w:pPr>
+      <w:r>
+        <w:rPr>
+          <w:rFonts w:ascii="Arial" w:hAnsi="Arial" w:cs="Arial"/>
+          <w:szCs w:val="20"/>
+        </w:rPr>
+        <w:t xml:space="preserve">La propuesta de enseñanza del machine </w:t>
+      </w:r>
+      <w:proofErr w:type="spellStart"/>
+      <w:r>
+        <w:rPr>
+          <w:rFonts w:ascii="Arial" w:hAnsi="Arial" w:cs="Arial"/>
+          <w:szCs w:val="20"/>
+        </w:rPr>
+        <w:t>learning</w:t>
+      </w:r>
+      <w:proofErr w:type="spellEnd"/>
+      <w:r>
+        <w:rPr>
+          <w:rFonts w:ascii="Arial" w:hAnsi="Arial" w:cs="Arial"/>
+          <w:szCs w:val="20"/>
+        </w:rPr>
+        <w:t xml:space="preserve"> en la Universidad de Antioquia, basada en el enfoque pedagógico del aprendizaje invertido y respaldada por diversas aplicaciones y plataformas tecnológicas, contribuye a varios Objetivos de Desarrollo Sostenible (ODS):</w:t>
+      </w:r>
+    </w:p>
+    <w:p>
+      <w:pPr>
+        <w:rPr>
+          <w:rFonts w:ascii="Arial" w:hAnsi="Arial" w:cs="Arial"/>
+          <w:szCs w:val="20"/>
+        </w:rPr>
+      </w:pPr>
+    </w:p>
+    <w:p>
+      <w:pPr>
+        <w:rPr>
+          <w:rFonts w:ascii="Arial" w:hAnsi="Arial" w:cs="Arial"/>
+          <w:szCs w:val="20"/>
+        </w:rPr>
+      </w:pPr>
+      <w:r>
+        <w:rPr>
+          <w:rFonts w:ascii="Arial" w:hAnsi="Arial" w:cs="Arial"/>
+          <w:szCs w:val="20"/>
+        </w:rPr>
+        <w:t xml:space="preserve">1. Educación de calidad (ODS 4): Al proporcionar una enseñanza innovadora y accesible, esta propuesta fomenta una educación de calidad al brindar a los estudiantes las habilidades y conocimientos necesarios en el campo del machine </w:t>
+      </w:r>
+      <w:proofErr w:type="spellStart"/>
+      <w:r>
+        <w:rPr>
+          <w:rFonts w:ascii="Arial" w:hAnsi="Arial" w:cs="Arial"/>
+          <w:szCs w:val="20"/>
+        </w:rPr>
+        <w:t>learning</w:t>
+      </w:r>
+      <w:proofErr w:type="spellEnd"/>
+      <w:r>
+        <w:rPr>
+          <w:rFonts w:ascii="Arial" w:hAnsi="Arial" w:cs="Arial"/>
+          <w:szCs w:val="20"/>
+        </w:rPr>
+        <w:t>. Esto los prepara para enfrentar los desafíos del mundo digital y promueve su participación en la economía basada en el conocimiento.</w:t>
+      </w:r>
+    </w:p>
+    <w:p>
+      <w:pPr>
+        <w:rPr>
+          <w:rFonts w:ascii="Arial" w:hAnsi="Arial" w:cs="Arial"/>
+          <w:szCs w:val="20"/>
+        </w:rPr>
+      </w:pPr>
+    </w:p>
+    <w:p>
+      <w:pPr>
+        <w:rPr>
+          <w:rFonts w:ascii="Arial" w:hAnsi="Arial" w:cs="Arial"/>
+          <w:szCs w:val="20"/>
+        </w:rPr>
+      </w:pPr>
+      <w:r>
+        <w:rPr>
+          <w:rFonts w:ascii="Arial" w:hAnsi="Arial" w:cs="Arial"/>
+          <w:szCs w:val="20"/>
+        </w:rPr>
+        <w:t xml:space="preserve">2. Trabajo decente y crecimiento económico (ODS 8): La enseñanza del machine </w:t>
+      </w:r>
+      <w:proofErr w:type="spellStart"/>
+      <w:r>
+        <w:rPr>
+          <w:rFonts w:ascii="Arial" w:hAnsi="Arial" w:cs="Arial"/>
+          <w:szCs w:val="20"/>
+        </w:rPr>
+        <w:t>learning</w:t>
+      </w:r>
+      <w:proofErr w:type="spellEnd"/>
+      <w:r>
+        <w:rPr>
+          <w:rFonts w:ascii="Arial" w:hAnsi="Arial" w:cs="Arial"/>
+          <w:szCs w:val="20"/>
+        </w:rPr>
+        <w:t xml:space="preserve"> prepara a los estudiantes para trabajar en un mercado laboral cada vez más impulsado por la tecnología. Les brinda habilidades en demanda y les permite contribuir a un crecimiento económico sostenible a través de la aplicación de técnicas de inteligencia artificial en diferentes sectores y organizaciones.</w:t>
+      </w:r>
+    </w:p>
+    <w:p>
+      <w:pPr>
+        <w:rPr>
+          <w:rFonts w:ascii="Arial" w:hAnsi="Arial" w:cs="Arial"/>
+          <w:szCs w:val="20"/>
+        </w:rPr>
+      </w:pPr>
+    </w:p>
+    <w:p>
+      <w:pPr>
+        <w:rPr>
+          <w:rFonts w:ascii="Arial" w:hAnsi="Arial" w:cs="Arial"/>
+          <w:szCs w:val="20"/>
+        </w:rPr>
+      </w:pPr>
+      <w:r>
+        <w:rPr>
+          <w:rFonts w:ascii="Arial" w:hAnsi="Arial" w:cs="Arial"/>
+          <w:szCs w:val="20"/>
+        </w:rPr>
+        <w:t xml:space="preserve">3. Industria, innovación e infraestructura (ODS 9): Al fomentar el aprendizaje de machine </w:t>
+      </w:r>
+      <w:proofErr w:type="spellStart"/>
+      <w:r>
+        <w:rPr>
+          <w:rFonts w:ascii="Arial" w:hAnsi="Arial" w:cs="Arial"/>
+          <w:szCs w:val="20"/>
+        </w:rPr>
+        <w:t>learning</w:t>
+      </w:r>
+      <w:proofErr w:type="spellEnd"/>
+      <w:r>
+        <w:rPr>
+          <w:rFonts w:ascii="Arial" w:hAnsi="Arial" w:cs="Arial"/>
+          <w:szCs w:val="20"/>
+        </w:rPr>
+        <w:t xml:space="preserve"> y su aplicación en la resolución de problemas, esta propuesta impulsa la innovación y la adopción de tecnologías avanzadas. Esto contribuye al desarrollo de infraestructuras tecnológicas y al fortalecimiento de la capacidad de las empresas y organizaciones para adoptar soluciones basadas en datos.</w:t>
+      </w:r>
+    </w:p>
+    <w:p>
+      <w:pPr>
+        <w:rPr>
+          <w:rFonts w:ascii="Arial" w:hAnsi="Arial" w:cs="Arial"/>
+          <w:szCs w:val="20"/>
+        </w:rPr>
+      </w:pPr>
+    </w:p>
+    <w:p>
+      <w:pPr>
+        <w:rPr>
+          <w:rFonts w:ascii="Arial" w:hAnsi="Arial" w:cs="Arial"/>
+          <w:szCs w:val="20"/>
+        </w:rPr>
+      </w:pPr>
+      <w:r>
+        <w:rPr>
+          <w:rFonts w:ascii="Arial" w:hAnsi="Arial" w:cs="Arial"/>
+          <w:szCs w:val="20"/>
+        </w:rPr>
+        <w:t>4. Alianzas para lograr los objetivos (ODS 17): Esta propuesta de enseñanza promueve la colaboración y las alianzas estratégicas con diferentes actores, incluyendo empresas, plataformas tecnológicas y redes sociales. Estas colaboraciones fortalecen la transferencia de conocimientos, la participación conjunta en proyectos y el intercambio de recursos, impulsando así el avance de los objetivos de desarrollo sostenible.</w:t>
+      </w:r>
+    </w:p>
+    <w:p>
+      <w:pPr>
+        <w:rPr>
+          <w:rFonts w:ascii="Arial" w:hAnsi="Arial" w:cs="Arial"/>
+          <w:szCs w:val="20"/>
+        </w:rPr>
+      </w:pPr>
+    </w:p>
+    <w:p>
+      <w:pPr>
+        <w:rPr>
+          <w:rFonts w:ascii="Arial" w:hAnsi="Arial" w:cs="Arial"/>
+          <w:szCs w:val="20"/>
+        </w:rPr>
+      </w:pPr>
+      <w:r>
+        <w:rPr>
+          <w:rFonts w:ascii="Arial" w:hAnsi="Arial" w:cs="Arial"/>
+          <w:szCs w:val="20"/>
+        </w:rPr>
+        <w:t xml:space="preserve">En resumen, la propuesta de enseñanza del machine </w:t>
+      </w:r>
+      <w:proofErr w:type="spellStart"/>
+      <w:r>
+        <w:rPr>
+          <w:rFonts w:ascii="Arial" w:hAnsi="Arial" w:cs="Arial"/>
+          <w:szCs w:val="20"/>
+        </w:rPr>
+        <w:t>learning</w:t>
+      </w:r>
+      <w:proofErr w:type="spellEnd"/>
+      <w:r>
+        <w:rPr>
+          <w:rFonts w:ascii="Arial" w:hAnsi="Arial" w:cs="Arial"/>
+          <w:szCs w:val="20"/>
+        </w:rPr>
+        <w:t xml:space="preserve"> en la Universidad de Antioquia no solo forma a los estudiantes en un campo tecnológico de vanguardia, sino que también contribuye directamente a </w:t>
+      </w:r>
+      <w:r>
+        <w:rPr>
+          <w:rFonts w:ascii="Arial" w:hAnsi="Arial" w:cs="Arial"/>
+          <w:szCs w:val="20"/>
+        </w:rPr>
+        <w:lastRenderedPageBreak/>
+        <w:t>varios Objetivos de Desarrollo Sostenible al promover una educación de calidad, el desarrollo económico, la innovación y las alianzas para lograr un futuro sostenible.</w:t>
+      </w:r>
+    </w:p>
+    <w:p>
+      <w:pPr>
+        <w:rPr>
+          <w:rFonts w:ascii="Arial" w:hAnsi="Arial" w:cs="Arial"/>
+          <w:szCs w:val="20"/>
+        </w:rPr>
+      </w:pPr>
+    </w:p>
+    <w:p>
+      <w:pPr>
+        <w:rPr>
+          <w:rFonts w:ascii="Arial" w:hAnsi="Arial" w:cs="Arial"/>
+          <w:szCs w:val="20"/>
+        </w:rPr>
+      </w:pPr>
+    </w:p>
+    <w:p>
+      <w:pPr>
+        <w:rPr>
+          <w:rFonts w:ascii="Arial" w:hAnsi="Arial" w:cs="Arial"/>
+          <w:szCs w:val="20"/>
+        </w:rPr>
+      </w:pPr>
+    </w:p>
+    <w:p>
+      <w:pPr>
+        <w:rPr>
+          <w:rFonts w:ascii="Arial" w:hAnsi="Arial" w:cs="Arial"/>
+          <w:szCs w:val="20"/>
+        </w:rPr>
+      </w:pPr>
+      <w:r>
+        <w:rPr>
+          <w:rFonts w:ascii="Arial" w:hAnsi="Arial" w:cs="Arial"/>
+          <w:szCs w:val="20"/>
+        </w:rPr>
+        <w:t>Breve biografía del profesor Marco Julio Cañas Campillo</w:t>
+      </w:r>
+    </w:p>
+    <w:p>
+      <w:pPr>
+        <w:rPr>
+          <w:rFonts w:ascii="Arial" w:hAnsi="Arial" w:cs="Arial"/>
+          <w:szCs w:val="20"/>
+        </w:rPr>
+      </w:pPr>
+    </w:p>
+    <w:p>
+      <w:pPr>
+        <w:rPr>
+          <w:rFonts w:ascii="Arial" w:hAnsi="Arial" w:cs="Arial"/>
+          <w:szCs w:val="20"/>
+        </w:rPr>
+      </w:pPr>
+      <w:r>
+        <w:rPr>
+          <w:rFonts w:ascii="Arial" w:hAnsi="Arial" w:cs="Arial"/>
+          <w:szCs w:val="20"/>
+        </w:rPr>
+        <w:t>Breve biografía de</w:t>
+      </w:r>
+      <w:r>
+        <w:rPr>
+          <w:rFonts w:ascii="Arial" w:hAnsi="Arial" w:cs="Arial"/>
+          <w:szCs w:val="20"/>
+        </w:rPr>
+        <w:t xml:space="preserve"> </w:t>
+      </w:r>
+      <w:r>
+        <w:rPr>
+          <w:rFonts w:ascii="Arial" w:hAnsi="Arial" w:cs="Arial"/>
+          <w:szCs w:val="20"/>
+        </w:rPr>
+        <w:t>l</w:t>
+      </w:r>
+      <w:r>
+        <w:rPr>
+          <w:rFonts w:ascii="Arial" w:hAnsi="Arial" w:cs="Arial"/>
+          <w:szCs w:val="20"/>
+        </w:rPr>
+        <w:t>a</w:t>
+      </w:r>
+      <w:r>
+        <w:rPr>
+          <w:rFonts w:ascii="Arial" w:hAnsi="Arial" w:cs="Arial"/>
+          <w:szCs w:val="20"/>
+        </w:rPr>
+        <w:t xml:space="preserve"> profesor</w:t>
+      </w:r>
+      <w:r>
+        <w:rPr>
+          <w:rFonts w:ascii="Arial" w:hAnsi="Arial" w:cs="Arial"/>
+          <w:szCs w:val="20"/>
+        </w:rPr>
+        <w:t>a</w:t>
+      </w:r>
+      <w:r>
+        <w:rPr>
+          <w:rFonts w:ascii="Arial" w:hAnsi="Arial" w:cs="Arial"/>
+          <w:szCs w:val="20"/>
+        </w:rPr>
+        <w:t xml:space="preserve"> </w:t>
+      </w:r>
+      <w:r>
+        <w:rPr>
+          <w:rFonts w:ascii="Arial" w:hAnsi="Arial" w:cs="Arial"/>
+          <w:szCs w:val="20"/>
+        </w:rPr>
+        <w:t xml:space="preserve">Luz Mariela </w:t>
+      </w:r>
+      <w:proofErr w:type="spellStart"/>
+      <w:r>
+        <w:rPr>
+          <w:rFonts w:ascii="Arial" w:hAnsi="Arial" w:cs="Arial"/>
+          <w:szCs w:val="20"/>
+        </w:rPr>
+        <w:t>Lopez</w:t>
+      </w:r>
+      <w:proofErr w:type="spellEnd"/>
+      <w:r>
+        <w:rPr>
+          <w:rFonts w:ascii="Arial" w:hAnsi="Arial" w:cs="Arial"/>
+          <w:szCs w:val="20"/>
+        </w:rPr>
+        <w:t xml:space="preserve"> </w:t>
+      </w:r>
+      <w:proofErr w:type="spellStart"/>
+      <w:r>
+        <w:rPr>
+          <w:rFonts w:ascii="Arial" w:hAnsi="Arial" w:cs="Arial"/>
+          <w:szCs w:val="20"/>
+        </w:rPr>
+        <w:t>Nohava</w:t>
+      </w:r>
+      <w:proofErr w:type="spellEnd"/>
+    </w:p>
+    <w:p>
+      <w:pPr>
+        <w:rPr>
+          <w:rFonts w:ascii="Arial" w:hAnsi="Arial" w:cs="Arial"/>
+          <w:szCs w:val="20"/>
+        </w:rPr>
+      </w:pPr>
+    </w:p>
+    <w:p>
+      <w:pPr>
+        <w:rPr>
+          <w:rFonts w:ascii="Arial" w:hAnsi="Arial" w:cs="Arial"/>
+          <w:szCs w:val="20"/>
+        </w:rPr>
+      </w:pPr>
     </w:p>
     <w:p>
       <w:pPr>

</xml_diff>